<commit_message>
update on 2026-04-22 02:51:38.693911
</commit_message>
<xml_diff>
--- a/py - comm.docx
+++ b/py - comm.docx
@@ -1166,6 +1166,834 @@
         </w:rPr>
       </w:pPr>
       <w:bookmarkStart w:id="0" w:name="_Toc25118"/>
+    </w:p>
+    <w:p>
+      <w:pPr>
+        <w:outlineLvl w:val="9"/>
+        <w:rPr>
+          <w:rFonts w:hint="eastAsia" w:cs="华文中宋"/>
+          <w:bCs/>
+          <w:color w:val="70AD47" w:themeColor="accent6"/>
+          <w:szCs w:val="24"/>
+          <w:lang w:val="en-US" w:eastAsia="zh-CN"/>
+          <w14:textFill>
+            <w14:solidFill>
+              <w14:schemeClr w14:val="accent6"/>
+            </w14:solidFill>
+          </w14:textFill>
+        </w:rPr>
+      </w:pPr>
+    </w:p>
+    <w:p>
+      <w:pPr>
+        <w:outlineLvl w:val="9"/>
+        <w:rPr>
+          <w:rFonts w:hint="eastAsia" w:cs="华文中宋"/>
+          <w:bCs/>
+          <w:color w:val="70AD47" w:themeColor="accent6"/>
+          <w:szCs w:val="24"/>
+          <w:lang w:val="en-US" w:eastAsia="zh-CN"/>
+          <w14:textFill>
+            <w14:solidFill>
+              <w14:schemeClr w14:val="accent6"/>
+            </w14:solidFill>
+          </w14:textFill>
+        </w:rPr>
+      </w:pPr>
+    </w:p>
+    <w:p>
+      <w:pPr>
+        <w:outlineLvl w:val="0"/>
+        <w:rPr>
+          <w:rFonts w:hint="default" w:cs="华文中宋"/>
+          <w:bCs/>
+          <w:color w:val="70AD47" w:themeColor="accent6"/>
+          <w:szCs w:val="24"/>
+          <w:lang w:val="en-US" w:eastAsia="zh-CN"/>
+          <w14:textFill>
+            <w14:solidFill>
+              <w14:schemeClr w14:val="accent6"/>
+            </w14:solidFill>
+          </w14:textFill>
+        </w:rPr>
+      </w:pPr>
+      <w:r>
+        <w:rPr>
+          <w:rFonts w:hint="eastAsia" w:cs="华文中宋"/>
+          <w:bCs/>
+          <w:color w:val="70AD47" w:themeColor="accent6"/>
+          <w:szCs w:val="24"/>
+          <w:lang w:val="en-US" w:eastAsia="zh-CN"/>
+          <w14:textFill>
+            <w14:solidFill>
+              <w14:schemeClr w14:val="accent6"/>
+            </w14:solidFill>
+          </w14:textFill>
+        </w:rPr>
+        <w:t>大模型langchain_core：</w:t>
+      </w:r>
+    </w:p>
+    <w:tbl>
+      <w:tblPr>
+        <w:tblStyle w:val="11"/>
+        <w:tblW w:w="0" w:type="auto"/>
+        <w:tblInd w:w="0" w:type="dxa"/>
+        <w:tblBorders>
+          <w:top w:val="single" w:color="auto" w:sz="4" w:space="0"/>
+          <w:left w:val="single" w:color="auto" w:sz="4" w:space="0"/>
+          <w:bottom w:val="single" w:color="auto" w:sz="4" w:space="0"/>
+          <w:right w:val="single" w:color="auto" w:sz="4" w:space="0"/>
+          <w:insideH w:val="single" w:color="auto" w:sz="4" w:space="0"/>
+          <w:insideV w:val="single" w:color="auto" w:sz="4" w:space="0"/>
+        </w:tblBorders>
+        <w:tblLayout w:type="autofit"/>
+        <w:tblCellMar>
+          <w:top w:w="0" w:type="dxa"/>
+          <w:left w:w="108" w:type="dxa"/>
+          <w:bottom w:w="0" w:type="dxa"/>
+          <w:right w:w="108" w:type="dxa"/>
+        </w:tblCellMar>
+      </w:tblPr>
+      <w:tblGrid>
+        <w:gridCol w:w="1423"/>
+        <w:gridCol w:w="6413"/>
+        <w:gridCol w:w="1968"/>
+      </w:tblGrid>
+      <w:tr>
+        <w:tblPrEx>
+          <w:tblBorders>
+            <w:top w:val="single" w:color="auto" w:sz="4" w:space="0"/>
+            <w:left w:val="single" w:color="auto" w:sz="4" w:space="0"/>
+            <w:bottom w:val="single" w:color="auto" w:sz="4" w:space="0"/>
+            <w:right w:val="single" w:color="auto" w:sz="4" w:space="0"/>
+            <w:insideH w:val="single" w:color="auto" w:sz="4" w:space="0"/>
+            <w:insideV w:val="single" w:color="auto" w:sz="4" w:space="0"/>
+          </w:tblBorders>
+          <w:tblCellMar>
+            <w:top w:w="0" w:type="dxa"/>
+            <w:left w:w="108" w:type="dxa"/>
+            <w:bottom w:w="0" w:type="dxa"/>
+            <w:right w:w="108" w:type="dxa"/>
+          </w:tblCellMar>
+        </w:tblPrEx>
+        <w:tc>
+          <w:tcPr>
+            <w:tcW w:w="0" w:type="auto"/>
+            <w:gridSpan w:val="3"/>
+            <w:vAlign w:val="center"/>
+          </w:tcPr>
+          <w:p>
+            <w:pPr>
+              <w:rPr>
+                <w:rFonts w:hint="default" w:cs="华文中宋"/>
+                <w:bCs/>
+                <w:color w:val="EA82F1"/>
+                <w:spacing w:val="7"/>
+                <w:lang w:val="en-US" w:eastAsia="zh-CN"/>
+              </w:rPr>
+            </w:pPr>
+            <w:r>
+              <w:rPr>
+                <w:rFonts w:hint="eastAsia" w:cs="华文中宋"/>
+                <w:bCs/>
+                <w:color w:val="ED7D31" w:themeColor="accent2"/>
+                <w:spacing w:val="7"/>
+                <w:lang w:val="en-US" w:eastAsia="zh-CN"/>
+                <w14:textFill>
+                  <w14:solidFill>
+                    <w14:schemeClr w14:val="accent2"/>
+                  </w14:solidFill>
+                </w14:textFill>
+              </w:rPr>
+              <w:t>langchain_openai：</w:t>
+            </w:r>
+          </w:p>
+        </w:tc>
+      </w:tr>
+      <w:tr>
+        <w:tblPrEx>
+          <w:tblBorders>
+            <w:top w:val="single" w:color="auto" w:sz="4" w:space="0"/>
+            <w:left w:val="single" w:color="auto" w:sz="4" w:space="0"/>
+            <w:bottom w:val="single" w:color="auto" w:sz="4" w:space="0"/>
+            <w:right w:val="single" w:color="auto" w:sz="4" w:space="0"/>
+            <w:insideH w:val="single" w:color="auto" w:sz="4" w:space="0"/>
+            <w:insideV w:val="single" w:color="auto" w:sz="4" w:space="0"/>
+          </w:tblBorders>
+          <w:tblCellMar>
+            <w:top w:w="0" w:type="dxa"/>
+            <w:left w:w="108" w:type="dxa"/>
+            <w:bottom w:w="0" w:type="dxa"/>
+            <w:right w:w="108" w:type="dxa"/>
+          </w:tblCellMar>
+        </w:tblPrEx>
+        <w:tc>
+          <w:tcPr>
+            <w:tcW w:w="0" w:type="auto"/>
+            <w:gridSpan w:val="2"/>
+            <w:vAlign w:val="center"/>
+          </w:tcPr>
+          <w:p>
+            <w:pPr>
+              <w:rPr>
+                <w:rFonts w:hint="default" w:eastAsia="华文中宋" w:cs="华文中宋"/>
+                <w:bCs/>
+                <w:color w:val="FF0000"/>
+                <w:spacing w:val="7"/>
+                <w:lang w:val="en-US" w:eastAsia="zh-CN"/>
+              </w:rPr>
+            </w:pPr>
+            <w:r>
+              <w:rPr>
+                <w:rFonts w:hint="eastAsia" w:cs="华文中宋"/>
+                <w:bCs/>
+                <w:color w:val="FF0000"/>
+                <w:spacing w:val="7"/>
+                <w:lang w:val="en-US" w:eastAsia="zh-CN"/>
+              </w:rPr>
+              <w:t>ChatOpenAI(model, api_key, base_url, temperature)</w:t>
+            </w:r>
+            <w:r>
+              <w:rPr>
+                <w:rFonts w:hint="eastAsia" w:cs="华文中宋"/>
+                <w:b/>
+                <w:bCs/>
+                <w:color w:val="FF0000"/>
+                <w:kern w:val="2"/>
+                <w:sz w:val="21"/>
+                <w:szCs w:val="21"/>
+                <w:lang w:val="en-US" w:eastAsia="zh-CN" w:bidi="ar-SA"/>
+              </w:rPr>
+              <w:t xml:space="preserve"> </w:t>
+            </w:r>
+            <w:r>
+              <w:rPr>
+                <w:rFonts w:hint="eastAsia" w:cs="华文中宋"/>
+                <w:b/>
+                <w:bCs/>
+                <w:color w:val="ED7D31" w:themeColor="accent2"/>
+                <w:kern w:val="2"/>
+                <w:sz w:val="21"/>
+                <w:szCs w:val="21"/>
+                <w:lang w:val="en-US" w:eastAsia="zh-CN" w:bidi="ar-SA"/>
+                <w14:textFill>
+                  <w14:solidFill>
+                    <w14:schemeClr w14:val="accent2"/>
+                  </w14:solidFill>
+                </w14:textFill>
+              </w:rPr>
+              <w:t>&lt;- BaseChatModel</w:t>
+            </w:r>
+          </w:p>
+        </w:tc>
+        <w:tc>
+          <w:tcPr>
+            <w:tcW w:w="0" w:type="auto"/>
+            <w:vAlign w:val="center"/>
+          </w:tcPr>
+          <w:p>
+            <w:pPr>
+              <w:rPr>
+                <w:rFonts w:hint="default" w:eastAsia="华文中宋" w:cs="华文中宋"/>
+                <w:bCs/>
+                <w:color w:val="ED7D31" w:themeColor="accent2"/>
+                <w:spacing w:val="7"/>
+                <w:lang w:val="en-US" w:eastAsia="zh-CN"/>
+                <w14:textFill>
+                  <w14:solidFill>
+                    <w14:schemeClr w14:val="accent2"/>
+                  </w14:solidFill>
+                </w14:textFill>
+              </w:rPr>
+            </w:pPr>
+            <w:r>
+              <w:rPr>
+                <w:rFonts w:hint="eastAsia" w:cs="华文中宋"/>
+                <w:bCs/>
+                <w:color w:val="EA82F1"/>
+                <w:spacing w:val="7"/>
+                <w:lang w:val="en-US" w:eastAsia="zh-CN"/>
+              </w:rPr>
+              <w:t>OpenAI客户端</w:t>
+            </w:r>
+          </w:p>
+        </w:tc>
+      </w:tr>
+      <w:tr>
+        <w:tblPrEx>
+          <w:tblBorders>
+            <w:top w:val="single" w:color="auto" w:sz="4" w:space="0"/>
+            <w:left w:val="single" w:color="auto" w:sz="4" w:space="0"/>
+            <w:bottom w:val="single" w:color="auto" w:sz="4" w:space="0"/>
+            <w:right w:val="single" w:color="auto" w:sz="4" w:space="0"/>
+            <w:insideH w:val="single" w:color="auto" w:sz="4" w:space="0"/>
+            <w:insideV w:val="single" w:color="auto" w:sz="4" w:space="0"/>
+          </w:tblBorders>
+          <w:tblCellMar>
+            <w:top w:w="0" w:type="dxa"/>
+            <w:left w:w="108" w:type="dxa"/>
+            <w:bottom w:w="0" w:type="dxa"/>
+            <w:right w:w="108" w:type="dxa"/>
+          </w:tblCellMar>
+        </w:tblPrEx>
+        <w:tc>
+          <w:tcPr>
+            <w:tcW w:w="0" w:type="auto"/>
+            <w:vAlign w:val="center"/>
+          </w:tcPr>
+          <w:p>
+            <w:pPr>
+              <w:rPr>
+                <w:rFonts w:hint="default" w:cs="华文中宋"/>
+                <w:bCs/>
+                <w:color w:val="FF0000"/>
+                <w:spacing w:val="7"/>
+                <w:lang w:val="en-US" w:eastAsia="zh-CN"/>
+              </w:rPr>
+            </w:pPr>
+            <w:r>
+              <w:rPr>
+                <w:rFonts w:hint="eastAsia" w:cs="华文中宋"/>
+                <w:bCs/>
+                <w:color w:val="ED7D31" w:themeColor="accent2"/>
+                <w:spacing w:val="7"/>
+                <w:lang w:val="en-US" w:eastAsia="zh-CN"/>
+                <w14:textFill>
+                  <w14:solidFill>
+                    <w14:schemeClr w14:val="accent2"/>
+                  </w14:solidFill>
+                </w14:textFill>
+              </w:rPr>
+              <w:t>实例方法</w:t>
+            </w:r>
+          </w:p>
+        </w:tc>
+        <w:tc>
+          <w:tcPr>
+            <w:tcW w:w="0" w:type="auto"/>
+            <w:vAlign w:val="center"/>
+          </w:tcPr>
+          <w:p>
+            <w:pPr>
+              <w:rPr>
+                <w:rFonts w:hint="default" w:cs="华文中宋"/>
+                <w:bCs/>
+                <w:color w:val="FF0000"/>
+                <w:spacing w:val="7"/>
+                <w:lang w:val="en-US" w:eastAsia="zh-CN"/>
+              </w:rPr>
+            </w:pPr>
+            <w:r>
+              <w:rPr>
+                <w:rFonts w:hint="eastAsia" w:cs="华文中宋"/>
+                <w:bCs/>
+                <w:color w:val="FF0000"/>
+                <w:spacing w:val="7"/>
+                <w:lang w:val="en-US" w:eastAsia="zh-CN"/>
+              </w:rPr>
+              <w:t>with_structured_output(</w:t>
+            </w:r>
+            <w:r>
+              <w:rPr>
+                <w:rFonts w:hint="eastAsia" w:cs="华文中宋"/>
+                <w:b/>
+                <w:bCs/>
+                <w:color w:val="ED7D31" w:themeColor="accent2"/>
+                <w:kern w:val="2"/>
+                <w:sz w:val="21"/>
+                <w:szCs w:val="21"/>
+                <w:lang w:val="en-US" w:eastAsia="zh-CN" w:bidi="ar-SA"/>
+                <w14:textFill>
+                  <w14:solidFill>
+                    <w14:schemeClr w14:val="accent2"/>
+                  </w14:solidFill>
+                </w14:textFill>
+              </w:rPr>
+              <w:t>pydantic.BaseModel</w:t>
+            </w:r>
+            <w:r>
+              <w:rPr>
+                <w:rFonts w:hint="eastAsia" w:cs="华文中宋"/>
+                <w:bCs/>
+                <w:color w:val="FF0000"/>
+                <w:spacing w:val="7"/>
+                <w:lang w:val="en-US" w:eastAsia="zh-CN"/>
+              </w:rPr>
+              <w:t>)</w:t>
+            </w:r>
+          </w:p>
+        </w:tc>
+        <w:tc>
+          <w:tcPr>
+            <w:tcW w:w="0" w:type="auto"/>
+            <w:vAlign w:val="center"/>
+          </w:tcPr>
+          <w:p>
+            <w:pPr>
+              <w:rPr>
+                <w:rFonts w:hint="default" w:cs="华文中宋"/>
+                <w:bCs/>
+                <w:color w:val="EA82F1"/>
+                <w:spacing w:val="7"/>
+                <w:lang w:val="en-US" w:eastAsia="zh-CN"/>
+              </w:rPr>
+            </w:pPr>
+            <w:r>
+              <w:rPr>
+                <w:rFonts w:hint="eastAsia" w:cs="华文中宋"/>
+                <w:bCs/>
+                <w:color w:val="EA82F1"/>
+                <w:spacing w:val="7"/>
+                <w:lang w:val="en-US" w:eastAsia="zh-CN"/>
+              </w:rPr>
+              <w:t>结构化输出</w:t>
+            </w:r>
+            <w:r>
+              <w:rPr>
+                <w:rFonts w:hint="eastAsia" w:cs="华文中宋"/>
+                <w:b/>
+                <w:bCs/>
+                <w:color w:val="ED7D31" w:themeColor="accent2"/>
+                <w:kern w:val="2"/>
+                <w:sz w:val="21"/>
+                <w:szCs w:val="21"/>
+                <w:lang w:val="en-US" w:eastAsia="zh-CN" w:bidi="ar-SA"/>
+                <w14:textFill>
+                  <w14:solidFill>
+                    <w14:schemeClr w14:val="accent2"/>
+                  </w14:solidFill>
+                </w14:textFill>
+              </w:rPr>
+              <w:t>包装器</w:t>
+            </w:r>
+          </w:p>
+        </w:tc>
+      </w:tr>
+    </w:tbl>
+    <w:p>
+      <w:pPr>
+        <w:outlineLvl w:val="9"/>
+        <w:rPr>
+          <w:rFonts w:hint="default" w:cs="华文中宋"/>
+          <w:bCs/>
+          <w:color w:val="70AD47" w:themeColor="accent6"/>
+          <w:szCs w:val="24"/>
+          <w:lang w:val="en-US" w:eastAsia="zh-CN"/>
+          <w14:textFill>
+            <w14:solidFill>
+              <w14:schemeClr w14:val="accent6"/>
+            </w14:solidFill>
+          </w14:textFill>
+        </w:rPr>
+      </w:pPr>
+    </w:p>
+    <w:p>
+      <w:pPr>
+        <w:pStyle w:val="2"/>
+        <w:bidi w:val="0"/>
+        <w:rPr>
+          <w:rFonts w:hint="default" w:cs="华文中宋"/>
+          <w:bCs/>
+          <w:color w:val="70AD47" w:themeColor="accent6"/>
+          <w:szCs w:val="24"/>
+          <w:lang w:val="en-US" w:eastAsia="zh-CN"/>
+          <w14:textFill>
+            <w14:solidFill>
+              <w14:schemeClr w14:val="accent6"/>
+            </w14:solidFill>
+          </w14:textFill>
+        </w:rPr>
+      </w:pPr>
+      <w:r>
+        <w:rPr>
+          <w:rFonts w:hint="eastAsia"/>
+          <w:lang w:val="en-US" w:eastAsia="zh-CN"/>
+        </w:rPr>
+        <w:t>语言模型language_models：</w:t>
+      </w:r>
+    </w:p>
+    <w:tbl>
+      <w:tblPr>
+        <w:tblStyle w:val="11"/>
+        <w:tblW w:w="0" w:type="auto"/>
+        <w:tblInd w:w="0" w:type="dxa"/>
+        <w:tblBorders>
+          <w:top w:val="single" w:color="auto" w:sz="4" w:space="0"/>
+          <w:left w:val="single" w:color="auto" w:sz="4" w:space="0"/>
+          <w:bottom w:val="single" w:color="auto" w:sz="4" w:space="0"/>
+          <w:right w:val="single" w:color="auto" w:sz="4" w:space="0"/>
+          <w:insideH w:val="single" w:color="auto" w:sz="4" w:space="0"/>
+          <w:insideV w:val="single" w:color="auto" w:sz="4" w:space="0"/>
+        </w:tblBorders>
+        <w:tblLayout w:type="autofit"/>
+        <w:tblCellMar>
+          <w:top w:w="0" w:type="dxa"/>
+          <w:left w:w="108" w:type="dxa"/>
+          <w:bottom w:w="0" w:type="dxa"/>
+          <w:right w:w="108" w:type="dxa"/>
+        </w:tblCellMar>
+      </w:tblPr>
+      <w:tblGrid>
+        <w:gridCol w:w="1113"/>
+        <w:gridCol w:w="1658"/>
+        <w:gridCol w:w="1113"/>
+      </w:tblGrid>
+      <w:tr>
+        <w:tblPrEx>
+          <w:tblBorders>
+            <w:top w:val="single" w:color="auto" w:sz="4" w:space="0"/>
+            <w:left w:val="single" w:color="auto" w:sz="4" w:space="0"/>
+            <w:bottom w:val="single" w:color="auto" w:sz="4" w:space="0"/>
+            <w:right w:val="single" w:color="auto" w:sz="4" w:space="0"/>
+            <w:insideH w:val="single" w:color="auto" w:sz="4" w:space="0"/>
+            <w:insideV w:val="single" w:color="auto" w:sz="4" w:space="0"/>
+          </w:tblBorders>
+          <w:tblCellMar>
+            <w:top w:w="0" w:type="dxa"/>
+            <w:left w:w="108" w:type="dxa"/>
+            <w:bottom w:w="0" w:type="dxa"/>
+            <w:right w:w="108" w:type="dxa"/>
+          </w:tblCellMar>
+        </w:tblPrEx>
+        <w:tc>
+          <w:tcPr>
+            <w:tcW w:w="0" w:type="auto"/>
+            <w:gridSpan w:val="2"/>
+            <w:vAlign w:val="center"/>
+          </w:tcPr>
+          <w:p>
+            <w:pPr>
+              <w:rPr>
+                <w:rFonts w:hint="default" w:eastAsia="华文中宋" w:cs="华文中宋"/>
+                <w:bCs/>
+                <w:color w:val="FF0000"/>
+                <w:spacing w:val="7"/>
+                <w:lang w:val="en-US" w:eastAsia="zh-CN"/>
+              </w:rPr>
+            </w:pPr>
+            <w:r>
+              <w:rPr>
+                <w:rFonts w:hint="eastAsia" w:cs="华文中宋"/>
+                <w:bCs/>
+                <w:color w:val="FF0000"/>
+                <w:spacing w:val="7"/>
+                <w:lang w:val="en-US" w:eastAsia="zh-CN"/>
+              </w:rPr>
+              <w:t>BaseChatModel</w:t>
+            </w:r>
+          </w:p>
+        </w:tc>
+        <w:tc>
+          <w:tcPr>
+            <w:tcW w:w="0" w:type="auto"/>
+            <w:vAlign w:val="center"/>
+          </w:tcPr>
+          <w:p>
+            <w:pPr>
+              <w:rPr>
+                <w:rFonts w:hint="default" w:eastAsia="华文中宋" w:cs="华文中宋"/>
+                <w:bCs/>
+                <w:color w:val="ED7D31" w:themeColor="accent2"/>
+                <w:spacing w:val="7"/>
+                <w:lang w:val="en-US" w:eastAsia="zh-CN"/>
+                <w14:textFill>
+                  <w14:solidFill>
+                    <w14:schemeClr w14:val="accent2"/>
+                  </w14:solidFill>
+                </w14:textFill>
+              </w:rPr>
+            </w:pPr>
+            <w:r>
+              <w:rPr>
+                <w:rFonts w:hint="eastAsia" w:cs="华文中宋"/>
+                <w:bCs/>
+                <w:color w:val="EA82EB"/>
+                <w:spacing w:val="7"/>
+                <w:lang w:val="en-US" w:eastAsia="zh-CN"/>
+              </w:rPr>
+              <w:t>聊天模型</w:t>
+            </w:r>
+          </w:p>
+        </w:tc>
+      </w:tr>
+      <w:tr>
+        <w:tblPrEx>
+          <w:tblBorders>
+            <w:top w:val="single" w:color="auto" w:sz="4" w:space="0"/>
+            <w:left w:val="single" w:color="auto" w:sz="4" w:space="0"/>
+            <w:bottom w:val="single" w:color="auto" w:sz="4" w:space="0"/>
+            <w:right w:val="single" w:color="auto" w:sz="4" w:space="0"/>
+            <w:insideH w:val="single" w:color="auto" w:sz="4" w:space="0"/>
+            <w:insideV w:val="single" w:color="auto" w:sz="4" w:space="0"/>
+          </w:tblBorders>
+          <w:tblCellMar>
+            <w:top w:w="0" w:type="dxa"/>
+            <w:left w:w="108" w:type="dxa"/>
+            <w:bottom w:w="0" w:type="dxa"/>
+            <w:right w:w="108" w:type="dxa"/>
+          </w:tblCellMar>
+        </w:tblPrEx>
+        <w:tc>
+          <w:tcPr>
+            <w:tcW w:w="0" w:type="auto"/>
+            <w:vAlign w:val="center"/>
+          </w:tcPr>
+          <w:p>
+            <w:pPr>
+              <w:rPr>
+                <w:rFonts w:hint="default" w:cs="华文中宋"/>
+                <w:bCs/>
+                <w:color w:val="FF0000"/>
+                <w:spacing w:val="7"/>
+                <w:lang w:val="en-US" w:eastAsia="zh-CN"/>
+              </w:rPr>
+            </w:pPr>
+            <w:r>
+              <w:rPr>
+                <w:rFonts w:hint="eastAsia" w:cs="华文中宋"/>
+                <w:bCs/>
+                <w:color w:val="ED7D31" w:themeColor="accent2"/>
+                <w:spacing w:val="7"/>
+                <w:lang w:val="en-US" w:eastAsia="zh-CN"/>
+                <w14:textFill>
+                  <w14:solidFill>
+                    <w14:schemeClr w14:val="accent2"/>
+                  </w14:solidFill>
+                </w14:textFill>
+              </w:rPr>
+              <w:t>实例方法</w:t>
+            </w:r>
+          </w:p>
+        </w:tc>
+        <w:tc>
+          <w:tcPr>
+            <w:tcW w:w="0" w:type="auto"/>
+            <w:vAlign w:val="center"/>
+          </w:tcPr>
+          <w:p>
+            <w:pPr>
+              <w:rPr>
+                <w:rFonts w:hint="default" w:cs="华文中宋"/>
+                <w:bCs/>
+                <w:color w:val="FF0000"/>
+                <w:spacing w:val="7"/>
+                <w:lang w:val="en-US" w:eastAsia="zh-CN"/>
+              </w:rPr>
+            </w:pPr>
+            <w:r>
+              <w:rPr>
+                <w:rFonts w:hint="eastAsia" w:cs="华文中宋"/>
+                <w:bCs/>
+                <w:color w:val="FF0000"/>
+                <w:spacing w:val="7"/>
+                <w:lang w:val="en-US" w:eastAsia="zh-CN"/>
+              </w:rPr>
+              <w:t>invoke(input)</w:t>
+            </w:r>
+          </w:p>
+        </w:tc>
+        <w:tc>
+          <w:tcPr>
+            <w:tcW w:w="0" w:type="auto"/>
+            <w:vAlign w:val="center"/>
+          </w:tcPr>
+          <w:p>
+            <w:pPr>
+              <w:rPr>
+                <w:rFonts w:hint="default" w:cs="华文中宋"/>
+                <w:bCs/>
+                <w:color w:val="EA82EB"/>
+                <w:spacing w:val="7"/>
+                <w:lang w:val="en-US" w:eastAsia="zh-CN"/>
+              </w:rPr>
+            </w:pPr>
+            <w:r>
+              <w:rPr>
+                <w:rFonts w:hint="eastAsia" w:cs="华文中宋"/>
+                <w:bCs/>
+                <w:color w:val="EA82EB"/>
+                <w:spacing w:val="7"/>
+                <w:lang w:val="en-US" w:eastAsia="zh-CN"/>
+              </w:rPr>
+              <w:t>调用</w:t>
+            </w:r>
+          </w:p>
+        </w:tc>
+      </w:tr>
+    </w:tbl>
+    <w:p>
+      <w:pPr>
+        <w:outlineLvl w:val="9"/>
+        <w:rPr>
+          <w:rFonts w:hint="default" w:cs="华文中宋"/>
+          <w:bCs/>
+          <w:color w:val="70AD47" w:themeColor="accent6"/>
+          <w:szCs w:val="24"/>
+          <w:lang w:val="en-US" w:eastAsia="zh-CN"/>
+          <w14:textFill>
+            <w14:solidFill>
+              <w14:schemeClr w14:val="accent6"/>
+            </w14:solidFill>
+          </w14:textFill>
+        </w:rPr>
+      </w:pPr>
+    </w:p>
+    <w:p>
+      <w:pPr>
+        <w:pStyle w:val="2"/>
+        <w:bidi w:val="0"/>
+        <w:rPr>
+          <w:rFonts w:hint="default" w:cs="华文中宋"/>
+          <w:bCs/>
+          <w:color w:val="70AD47" w:themeColor="accent6"/>
+          <w:szCs w:val="24"/>
+          <w:lang w:val="en-US" w:eastAsia="zh-CN"/>
+          <w14:textFill>
+            <w14:solidFill>
+              <w14:schemeClr w14:val="accent6"/>
+            </w14:solidFill>
+          </w14:textFill>
+        </w:rPr>
+      </w:pPr>
+      <w:r>
+        <w:rPr>
+          <w:rFonts w:hint="eastAsia"/>
+          <w:lang w:val="en-US" w:eastAsia="zh-CN"/>
+        </w:rPr>
+        <w:t>消息messages：</w:t>
+      </w:r>
+    </w:p>
+    <w:tbl>
+      <w:tblPr>
+        <w:tblStyle w:val="11"/>
+        <w:tblW w:w="0" w:type="auto"/>
+        <w:tblInd w:w="0" w:type="dxa"/>
+        <w:tblBorders>
+          <w:top w:val="single" w:color="auto" w:sz="4" w:space="0"/>
+          <w:left w:val="single" w:color="auto" w:sz="4" w:space="0"/>
+          <w:bottom w:val="single" w:color="auto" w:sz="4" w:space="0"/>
+          <w:right w:val="single" w:color="auto" w:sz="4" w:space="0"/>
+          <w:insideH w:val="single" w:color="auto" w:sz="4" w:space="0"/>
+          <w:insideV w:val="single" w:color="auto" w:sz="4" w:space="0"/>
+        </w:tblBorders>
+        <w:tblLayout w:type="autofit"/>
+        <w:tblCellMar>
+          <w:top w:w="0" w:type="dxa"/>
+          <w:left w:w="108" w:type="dxa"/>
+          <w:bottom w:w="0" w:type="dxa"/>
+          <w:right w:w="108" w:type="dxa"/>
+        </w:tblCellMar>
+      </w:tblPr>
+      <w:tblGrid>
+        <w:gridCol w:w="4889"/>
+        <w:gridCol w:w="1113"/>
+      </w:tblGrid>
+      <w:tr>
+        <w:tblPrEx>
+          <w:tblBorders>
+            <w:top w:val="single" w:color="auto" w:sz="4" w:space="0"/>
+            <w:left w:val="single" w:color="auto" w:sz="4" w:space="0"/>
+            <w:bottom w:val="single" w:color="auto" w:sz="4" w:space="0"/>
+            <w:right w:val="single" w:color="auto" w:sz="4" w:space="0"/>
+            <w:insideH w:val="single" w:color="auto" w:sz="4" w:space="0"/>
+            <w:insideV w:val="single" w:color="auto" w:sz="4" w:space="0"/>
+          </w:tblBorders>
+          <w:tblCellMar>
+            <w:top w:w="0" w:type="dxa"/>
+            <w:left w:w="108" w:type="dxa"/>
+            <w:bottom w:w="0" w:type="dxa"/>
+            <w:right w:w="108" w:type="dxa"/>
+          </w:tblCellMar>
+        </w:tblPrEx>
+        <w:tc>
+          <w:tcPr>
+            <w:tcW w:w="0" w:type="auto"/>
+            <w:vAlign w:val="center"/>
+          </w:tcPr>
+          <w:p>
+            <w:pPr>
+              <w:rPr>
+                <w:rFonts w:hint="default" w:eastAsia="华文中宋" w:cs="华文中宋"/>
+                <w:bCs/>
+                <w:color w:val="FF0000"/>
+                <w:spacing w:val="7"/>
+                <w:lang w:val="en-US" w:eastAsia="zh-CN"/>
+              </w:rPr>
+            </w:pPr>
+            <w:r>
+              <w:rPr>
+                <w:rFonts w:hint="eastAsia" w:cs="华文中宋"/>
+                <w:bCs/>
+                <w:color w:val="FF0000"/>
+                <w:spacing w:val="7"/>
+                <w:lang w:val="en-US" w:eastAsia="zh-CN"/>
+              </w:rPr>
+              <w:t xml:space="preserve">SystemMessage / </w:t>
+            </w:r>
+            <w:bookmarkStart w:id="8" w:name="_GoBack"/>
+            <w:bookmarkEnd w:id="8"/>
+            <w:r>
+              <w:rPr>
+                <w:rFonts w:hint="eastAsia" w:cs="华文中宋"/>
+                <w:bCs/>
+                <w:color w:val="FF0000"/>
+                <w:spacing w:val="7"/>
+                <w:lang w:val="en-US" w:eastAsia="zh-CN"/>
+              </w:rPr>
+              <w:t>HumanMessage(content)</w:t>
+            </w:r>
+          </w:p>
+        </w:tc>
+        <w:tc>
+          <w:tcPr>
+            <w:tcW w:w="0" w:type="auto"/>
+            <w:vAlign w:val="center"/>
+          </w:tcPr>
+          <w:p>
+            <w:pPr>
+              <w:rPr>
+                <w:rFonts w:hint="default" w:eastAsia="华文中宋" w:cs="华文中宋"/>
+                <w:bCs/>
+                <w:color w:val="ED7D31" w:themeColor="accent2"/>
+                <w:spacing w:val="7"/>
+                <w:lang w:val="en-US" w:eastAsia="zh-CN"/>
+                <w14:textFill>
+                  <w14:solidFill>
+                    <w14:schemeClr w14:val="accent2"/>
+                  </w14:solidFill>
+                </w14:textFill>
+              </w:rPr>
+            </w:pPr>
+            <w:r>
+              <w:rPr>
+                <w:rFonts w:hint="eastAsia" w:cs="华文中宋"/>
+                <w:bCs/>
+                <w:color w:val="EA82EB"/>
+                <w:spacing w:val="7"/>
+                <w:lang w:val="en-US" w:eastAsia="zh-CN"/>
+              </w:rPr>
+              <w:t>人类消息</w:t>
+            </w:r>
+          </w:p>
+        </w:tc>
+      </w:tr>
+    </w:tbl>
+    <w:p>
+      <w:pPr>
+        <w:outlineLvl w:val="9"/>
+        <w:rPr>
+          <w:rFonts w:hint="default" w:cs="华文中宋"/>
+          <w:bCs/>
+          <w:color w:val="70AD47" w:themeColor="accent6"/>
+          <w:szCs w:val="24"/>
+          <w:lang w:val="en-US" w:eastAsia="zh-CN"/>
+          <w14:textFill>
+            <w14:solidFill>
+              <w14:schemeClr w14:val="accent6"/>
+            </w14:solidFill>
+          </w14:textFill>
+        </w:rPr>
+      </w:pPr>
     </w:p>
     <w:p>
       <w:pPr>
@@ -4101,6 +4929,630 @@
     </w:p>
     <w:p>
       <w:pPr>
+        <w:rPr>
+          <w:rFonts w:cs="华文中宋"/>
+          <w:bCs/>
+          <w:color w:val="00B0F0"/>
+          <w:szCs w:val="24"/>
+        </w:rPr>
+      </w:pPr>
+    </w:p>
+    <w:p>
+      <w:pPr>
+        <w:outlineLvl w:val="0"/>
+        <w:rPr>
+          <w:rFonts w:hint="default" w:cs="华文中宋"/>
+          <w:bCs/>
+          <w:color w:val="70AD47" w:themeColor="accent6"/>
+          <w:szCs w:val="24"/>
+          <w:lang w:val="en-US" w:eastAsia="zh-CN"/>
+          <w14:textFill>
+            <w14:solidFill>
+              <w14:schemeClr w14:val="accent6"/>
+            </w14:solidFill>
+          </w14:textFill>
+        </w:rPr>
+      </w:pPr>
+      <w:r>
+        <w:rPr>
+          <w:rFonts w:hint="eastAsia" w:cs="华文中宋"/>
+          <w:bCs/>
+          <w:color w:val="70AD47" w:themeColor="accent6"/>
+          <w:szCs w:val="24"/>
+          <w:lang w:val="en-US" w:eastAsia="zh-CN"/>
+          <w14:textFill>
+            <w14:solidFill>
+              <w14:schemeClr w14:val="accent6"/>
+            </w14:solidFill>
+          </w14:textFill>
+        </w:rPr>
+        <w:t>数据pydantic：</w:t>
+      </w:r>
+    </w:p>
+    <w:tbl>
+      <w:tblPr>
+        <w:tblStyle w:val="11"/>
+        <w:tblW w:w="0" w:type="auto"/>
+        <w:tblInd w:w="0" w:type="dxa"/>
+        <w:tblBorders>
+          <w:top w:val="single" w:color="auto" w:sz="4" w:space="0"/>
+          <w:left w:val="single" w:color="auto" w:sz="4" w:space="0"/>
+          <w:bottom w:val="single" w:color="auto" w:sz="4" w:space="0"/>
+          <w:right w:val="single" w:color="auto" w:sz="4" w:space="0"/>
+          <w:insideH w:val="single" w:color="auto" w:sz="4" w:space="0"/>
+          <w:insideV w:val="single" w:color="auto" w:sz="4" w:space="0"/>
+        </w:tblBorders>
+        <w:tblLayout w:type="autofit"/>
+        <w:tblCellMar>
+          <w:top w:w="0" w:type="dxa"/>
+          <w:left w:w="108" w:type="dxa"/>
+          <w:bottom w:w="0" w:type="dxa"/>
+          <w:right w:w="108" w:type="dxa"/>
+        </w:tblCellMar>
+      </w:tblPr>
+      <w:tblGrid>
+        <w:gridCol w:w="5874"/>
+        <w:gridCol w:w="1478"/>
+      </w:tblGrid>
+      <w:tr>
+        <w:tblPrEx>
+          <w:tblBorders>
+            <w:top w:val="single" w:color="auto" w:sz="4" w:space="0"/>
+            <w:left w:val="single" w:color="auto" w:sz="4" w:space="0"/>
+            <w:bottom w:val="single" w:color="auto" w:sz="4" w:space="0"/>
+            <w:right w:val="single" w:color="auto" w:sz="4" w:space="0"/>
+            <w:insideH w:val="single" w:color="auto" w:sz="4" w:space="0"/>
+            <w:insideV w:val="single" w:color="auto" w:sz="4" w:space="0"/>
+          </w:tblBorders>
+          <w:tblCellMar>
+            <w:top w:w="0" w:type="dxa"/>
+            <w:left w:w="108" w:type="dxa"/>
+            <w:bottom w:w="0" w:type="dxa"/>
+            <w:right w:w="108" w:type="dxa"/>
+          </w:tblCellMar>
+        </w:tblPrEx>
+        <w:tc>
+          <w:tcPr>
+            <w:tcW w:w="0" w:type="auto"/>
+            <w:vAlign w:val="center"/>
+          </w:tcPr>
+          <w:p>
+            <w:pPr>
+              <w:rPr>
+                <w:rFonts w:hint="eastAsia" w:cs="华文中宋"/>
+                <w:bCs/>
+                <w:color w:val="FF0000"/>
+                <w:spacing w:val="7"/>
+                <w:lang w:val="en-US" w:eastAsia="zh-CN"/>
+              </w:rPr>
+            </w:pPr>
+            <w:r>
+              <w:rPr>
+                <w:rFonts w:hint="eastAsia" w:cs="华文中宋"/>
+                <w:bCs/>
+                <w:color w:val="FF0000"/>
+                <w:spacing w:val="7"/>
+                <w:lang w:val="en-US" w:eastAsia="zh-CN"/>
+              </w:rPr>
+              <w:t>Field(</w:t>
+            </w:r>
+          </w:p>
+          <w:p>
+            <w:pPr>
+              <w:ind w:firstLine="477"/>
+              <w:rPr>
+                <w:rFonts w:hint="default" w:cs="华文中宋"/>
+                <w:bCs/>
+                <w:color w:val="FF0000"/>
+                <w:spacing w:val="7"/>
+                <w:lang w:val="en-US" w:eastAsia="zh-CN"/>
+              </w:rPr>
+            </w:pPr>
+            <w:r>
+              <w:rPr>
+                <w:rFonts w:hint="eastAsia" w:cs="华文中宋"/>
+                <w:bCs/>
+                <w:color w:val="FF0000"/>
+                <w:spacing w:val="7"/>
+                <w:lang w:val="en-US" w:eastAsia="zh-CN"/>
+              </w:rPr>
+              <w:t>default, default_factory, alias, init, repr, # 信息</w:t>
+            </w:r>
+          </w:p>
+          <w:p>
+            <w:pPr>
+              <w:ind w:firstLine="477"/>
+              <w:rPr>
+                <w:rFonts w:hint="default" w:cs="华文中宋"/>
+                <w:bCs/>
+                <w:color w:val="FF0000"/>
+                <w:spacing w:val="7"/>
+                <w:lang w:val="en-US" w:eastAsia="zh-CN"/>
+              </w:rPr>
+            </w:pPr>
+            <w:r>
+              <w:rPr>
+                <w:rFonts w:hint="eastAsia" w:cs="华文中宋"/>
+                <w:bCs/>
+                <w:color w:val="FF0000"/>
+                <w:spacing w:val="7"/>
+                <w:lang w:val="en-US" w:eastAsia="zh-CN"/>
+              </w:rPr>
+              <w:t>title, description, # 元数据</w:t>
+            </w:r>
+          </w:p>
+          <w:p>
+            <w:pPr>
+              <w:ind w:firstLine="477"/>
+              <w:rPr>
+                <w:rFonts w:hint="default" w:cs="华文中宋"/>
+                <w:bCs/>
+                <w:color w:val="FF0000"/>
+                <w:spacing w:val="7"/>
+                <w:lang w:val="en-US" w:eastAsia="zh-CN"/>
+              </w:rPr>
+            </w:pPr>
+            <w:r>
+              <w:rPr>
+                <w:rFonts w:hint="eastAsia" w:cs="华文中宋"/>
+                <w:bCs/>
+                <w:color w:val="FF0000"/>
+                <w:spacing w:val="7"/>
+                <w:lang w:val="en-US" w:eastAsia="zh-CN"/>
+              </w:rPr>
+              <w:t>gt, ge, lt, le, # 数值</w:t>
+            </w:r>
+          </w:p>
+          <w:p>
+            <w:pPr>
+              <w:ind w:firstLine="477"/>
+              <w:rPr>
+                <w:rFonts w:hint="default" w:cs="华文中宋"/>
+                <w:bCs/>
+                <w:color w:val="FF0000"/>
+                <w:spacing w:val="7"/>
+                <w:lang w:val="en-US" w:eastAsia="zh-CN"/>
+              </w:rPr>
+            </w:pPr>
+            <w:r>
+              <w:rPr>
+                <w:rFonts w:hint="eastAsia" w:cs="华文中宋"/>
+                <w:bCs/>
+                <w:color w:val="FF0000"/>
+                <w:spacing w:val="7"/>
+                <w:lang w:val="en-US" w:eastAsia="zh-CN"/>
+              </w:rPr>
+              <w:t>min_length, max_length, pattern, # 容器</w:t>
+            </w:r>
+          </w:p>
+          <w:p>
+            <w:pPr>
+              <w:rPr>
+                <w:rFonts w:hint="default" w:eastAsia="华文中宋" w:cs="华文中宋"/>
+                <w:bCs/>
+                <w:color w:val="FF0000"/>
+                <w:spacing w:val="7"/>
+                <w:lang w:val="en-US" w:eastAsia="zh-CN"/>
+              </w:rPr>
+            </w:pPr>
+            <w:r>
+              <w:rPr>
+                <w:rFonts w:hint="eastAsia" w:cs="华文中宋"/>
+                <w:bCs/>
+                <w:color w:val="FF0000"/>
+                <w:spacing w:val="7"/>
+                <w:lang w:val="en-US" w:eastAsia="zh-CN"/>
+              </w:rPr>
+              <w:t>)</w:t>
+            </w:r>
+          </w:p>
+        </w:tc>
+        <w:tc>
+          <w:tcPr>
+            <w:tcW w:w="0" w:type="auto"/>
+            <w:vAlign w:val="center"/>
+          </w:tcPr>
+          <w:p>
+            <w:pPr>
+              <w:rPr>
+                <w:rFonts w:hint="default" w:cs="华文中宋"/>
+                <w:bCs/>
+                <w:color w:val="EA82F1"/>
+                <w:szCs w:val="24"/>
+                <w:lang w:val="en-US" w:eastAsia="zh-CN"/>
+              </w:rPr>
+            </w:pPr>
+            <w:r>
+              <w:rPr>
+                <w:rFonts w:hint="eastAsia" w:cs="华文中宋"/>
+                <w:bCs/>
+                <w:color w:val="EA82F1"/>
+                <w:szCs w:val="24"/>
+                <w:lang w:val="en-US" w:eastAsia="zh-CN"/>
+              </w:rPr>
+              <w:t>属性类型标注</w:t>
+            </w:r>
+          </w:p>
+        </w:tc>
+      </w:tr>
+    </w:tbl>
+    <w:p>
+      <w:pPr>
+        <w:rPr>
+          <w:rFonts w:cs="华文中宋"/>
+          <w:bCs/>
+          <w:color w:val="00B0F0"/>
+          <w:szCs w:val="24"/>
+        </w:rPr>
+      </w:pPr>
+    </w:p>
+    <w:tbl>
+      <w:tblPr>
+        <w:tblStyle w:val="11"/>
+        <w:tblW w:w="0" w:type="auto"/>
+        <w:tblInd w:w="0" w:type="dxa"/>
+        <w:tblBorders>
+          <w:top w:val="single" w:color="auto" w:sz="4" w:space="0"/>
+          <w:left w:val="single" w:color="auto" w:sz="4" w:space="0"/>
+          <w:bottom w:val="single" w:color="auto" w:sz="4" w:space="0"/>
+          <w:right w:val="single" w:color="auto" w:sz="4" w:space="0"/>
+          <w:insideH w:val="single" w:color="auto" w:sz="4" w:space="0"/>
+          <w:insideV w:val="single" w:color="auto" w:sz="4" w:space="0"/>
+        </w:tblBorders>
+        <w:tblLayout w:type="autofit"/>
+        <w:tblCellMar>
+          <w:top w:w="0" w:type="dxa"/>
+          <w:left w:w="108" w:type="dxa"/>
+          <w:bottom w:w="0" w:type="dxa"/>
+          <w:right w:w="108" w:type="dxa"/>
+        </w:tblCellMar>
+      </w:tblPr>
+      <w:tblGrid>
+        <w:gridCol w:w="1113"/>
+        <w:gridCol w:w="2521"/>
+        <w:gridCol w:w="1057"/>
+      </w:tblGrid>
+      <w:tr>
+        <w:tblPrEx>
+          <w:tblBorders>
+            <w:top w:val="single" w:color="auto" w:sz="4" w:space="0"/>
+            <w:left w:val="single" w:color="auto" w:sz="4" w:space="0"/>
+            <w:bottom w:val="single" w:color="auto" w:sz="4" w:space="0"/>
+            <w:right w:val="single" w:color="auto" w:sz="4" w:space="0"/>
+            <w:insideH w:val="single" w:color="auto" w:sz="4" w:space="0"/>
+            <w:insideV w:val="single" w:color="auto" w:sz="4" w:space="0"/>
+          </w:tblBorders>
+          <w:tblCellMar>
+            <w:top w:w="0" w:type="dxa"/>
+            <w:left w:w="108" w:type="dxa"/>
+            <w:bottom w:w="0" w:type="dxa"/>
+            <w:right w:w="108" w:type="dxa"/>
+          </w:tblCellMar>
+        </w:tblPrEx>
+        <w:tc>
+          <w:tcPr>
+            <w:tcW w:w="0" w:type="auto"/>
+            <w:gridSpan w:val="2"/>
+            <w:vAlign w:val="center"/>
+          </w:tcPr>
+          <w:p>
+            <w:pPr>
+              <w:jc w:val="both"/>
+              <w:rPr>
+                <w:rFonts w:hint="default" w:eastAsia="华文中宋" w:cs="华文中宋"/>
+                <w:bCs/>
+                <w:color w:val="FF0000"/>
+                <w:spacing w:val="7"/>
+                <w:lang w:val="en-US" w:eastAsia="zh-CN"/>
+              </w:rPr>
+            </w:pPr>
+            <w:r>
+              <w:rPr>
+                <w:rFonts w:hint="eastAsia" w:cs="华文中宋"/>
+                <w:bCs/>
+                <w:color w:val="FF0000"/>
+                <w:spacing w:val="7"/>
+                <w:lang w:val="en-US" w:eastAsia="zh-CN"/>
+              </w:rPr>
+              <w:t>BaseModel</w:t>
+            </w:r>
+          </w:p>
+        </w:tc>
+        <w:tc>
+          <w:tcPr>
+            <w:tcW w:w="0" w:type="auto"/>
+            <w:vAlign w:val="center"/>
+          </w:tcPr>
+          <w:p>
+            <w:pPr>
+              <w:jc w:val="both"/>
+              <w:rPr>
+                <w:rFonts w:hint="default" w:eastAsia="华文中宋" w:cs="华文中宋"/>
+                <w:bCs/>
+                <w:color w:val="ED7D31" w:themeColor="accent2"/>
+                <w:spacing w:val="7"/>
+                <w:lang w:val="en-US" w:eastAsia="zh-CN"/>
+                <w14:textFill>
+                  <w14:solidFill>
+                    <w14:schemeClr w14:val="accent2"/>
+                  </w14:solidFill>
+                </w14:textFill>
+              </w:rPr>
+            </w:pPr>
+            <w:r>
+              <w:rPr>
+                <w:rFonts w:hint="eastAsia" w:cs="华文中宋"/>
+                <w:bCs/>
+                <w:color w:val="EA82F1"/>
+                <w:szCs w:val="24"/>
+                <w:lang w:val="en-US" w:eastAsia="zh-CN"/>
+              </w:rPr>
+              <w:t>模型基类</w:t>
+            </w:r>
+          </w:p>
+        </w:tc>
+      </w:tr>
+      <w:tr>
+        <w:tblPrEx>
+          <w:tblBorders>
+            <w:top w:val="single" w:color="auto" w:sz="4" w:space="0"/>
+            <w:left w:val="single" w:color="auto" w:sz="4" w:space="0"/>
+            <w:bottom w:val="single" w:color="auto" w:sz="4" w:space="0"/>
+            <w:right w:val="single" w:color="auto" w:sz="4" w:space="0"/>
+            <w:insideH w:val="single" w:color="auto" w:sz="4" w:space="0"/>
+            <w:insideV w:val="single" w:color="auto" w:sz="4" w:space="0"/>
+          </w:tblBorders>
+          <w:tblCellMar>
+            <w:top w:w="0" w:type="dxa"/>
+            <w:left w:w="108" w:type="dxa"/>
+            <w:bottom w:w="0" w:type="dxa"/>
+            <w:right w:w="108" w:type="dxa"/>
+          </w:tblCellMar>
+        </w:tblPrEx>
+        <w:tc>
+          <w:tcPr>
+            <w:tcW w:w="0" w:type="auto"/>
+            <w:vMerge w:val="restart"/>
+            <w:vAlign w:val="center"/>
+          </w:tcPr>
+          <w:p>
+            <w:pPr>
+              <w:jc w:val="both"/>
+              <w:rPr>
+                <w:rFonts w:hint="default" w:cs="华文中宋"/>
+                <w:bCs/>
+                <w:color w:val="FF0000"/>
+                <w:spacing w:val="7"/>
+                <w:lang w:val="en-US" w:eastAsia="zh-CN"/>
+              </w:rPr>
+            </w:pPr>
+            <w:r>
+              <w:rPr>
+                <w:rFonts w:hint="eastAsia" w:cs="华文中宋"/>
+                <w:bCs/>
+                <w:color w:val="ED7D31" w:themeColor="accent2"/>
+                <w:spacing w:val="7"/>
+                <w:lang w:val="en-US" w:eastAsia="zh-CN"/>
+                <w14:textFill>
+                  <w14:solidFill>
+                    <w14:schemeClr w14:val="accent2"/>
+                  </w14:solidFill>
+                </w14:textFill>
+              </w:rPr>
+              <w:t>实例方法</w:t>
+            </w:r>
+          </w:p>
+        </w:tc>
+        <w:tc>
+          <w:tcPr>
+            <w:tcW w:w="0" w:type="auto"/>
+            <w:shd w:val="clear" w:color="auto" w:fill="auto"/>
+            <w:vAlign w:val="center"/>
+          </w:tcPr>
+          <w:p>
+            <w:pPr>
+              <w:jc w:val="both"/>
+              <w:rPr>
+                <w:rFonts w:hint="default" w:ascii="华文中宋" w:hAnsi="华文中宋" w:eastAsia="华文中宋" w:cs="华文中宋"/>
+                <w:b/>
+                <w:bCs/>
+                <w:color w:val="FF0000"/>
+                <w:spacing w:val="7"/>
+                <w:kern w:val="2"/>
+                <w:sz w:val="21"/>
+                <w:szCs w:val="21"/>
+                <w:lang w:val="en-US" w:eastAsia="zh-CN" w:bidi="ar-SA"/>
+              </w:rPr>
+            </w:pPr>
+            <w:r>
+              <w:rPr>
+                <w:rFonts w:hint="eastAsia" w:cs="华文中宋"/>
+                <w:bCs/>
+                <w:color w:val="FF0000"/>
+                <w:spacing w:val="7"/>
+                <w:lang w:val="en-US" w:eastAsia="zh-CN"/>
+              </w:rPr>
+              <w:t>model_json_schema()</w:t>
+            </w:r>
+          </w:p>
+        </w:tc>
+        <w:tc>
+          <w:tcPr>
+            <w:tcW w:w="0" w:type="auto"/>
+            <w:shd w:val="clear" w:color="auto" w:fill="auto"/>
+            <w:vAlign w:val="center"/>
+          </w:tcPr>
+          <w:p>
+            <w:pPr>
+              <w:jc w:val="both"/>
+              <w:rPr>
+                <w:rFonts w:hint="default" w:ascii="华文中宋" w:hAnsi="华文中宋" w:eastAsia="华文中宋" w:cs="华文中宋"/>
+                <w:b/>
+                <w:bCs/>
+                <w:color w:val="EA82F1"/>
+                <w:kern w:val="2"/>
+                <w:sz w:val="21"/>
+                <w:szCs w:val="24"/>
+                <w:lang w:val="en-US" w:eastAsia="zh-CN" w:bidi="ar-SA"/>
+              </w:rPr>
+            </w:pPr>
+            <w:r>
+              <w:rPr>
+                <w:rFonts w:hint="eastAsia" w:cs="华文中宋"/>
+                <w:b/>
+                <w:bCs/>
+                <w:color w:val="EA82F1"/>
+                <w:kern w:val="2"/>
+                <w:sz w:val="21"/>
+                <w:szCs w:val="24"/>
+                <w:lang w:val="en-US" w:eastAsia="zh-CN" w:bidi="ar-SA"/>
+              </w:rPr>
+              <w:t>模板</w:t>
+            </w:r>
+          </w:p>
+        </w:tc>
+      </w:tr>
+      <w:tr>
+        <w:tblPrEx>
+          <w:tblBorders>
+            <w:top w:val="single" w:color="auto" w:sz="4" w:space="0"/>
+            <w:left w:val="single" w:color="auto" w:sz="4" w:space="0"/>
+            <w:bottom w:val="single" w:color="auto" w:sz="4" w:space="0"/>
+            <w:right w:val="single" w:color="auto" w:sz="4" w:space="0"/>
+            <w:insideH w:val="single" w:color="auto" w:sz="4" w:space="0"/>
+            <w:insideV w:val="single" w:color="auto" w:sz="4" w:space="0"/>
+          </w:tblBorders>
+          <w:tblCellMar>
+            <w:top w:w="0" w:type="dxa"/>
+            <w:left w:w="108" w:type="dxa"/>
+            <w:bottom w:w="0" w:type="dxa"/>
+            <w:right w:w="108" w:type="dxa"/>
+          </w:tblCellMar>
+        </w:tblPrEx>
+        <w:tc>
+          <w:tcPr>
+            <w:tcW w:w="0" w:type="auto"/>
+            <w:vMerge w:val="continue"/>
+            <w:tcBorders/>
+            <w:vAlign w:val="center"/>
+          </w:tcPr>
+          <w:p>
+            <w:pPr>
+              <w:jc w:val="both"/>
+              <w:rPr>
+                <w:rFonts w:hint="eastAsia" w:cs="华文中宋"/>
+                <w:bCs/>
+                <w:color w:val="ED7D31" w:themeColor="accent2"/>
+                <w:spacing w:val="7"/>
+                <w:lang w:val="en-US" w:eastAsia="zh-CN"/>
+                <w14:textFill>
+                  <w14:solidFill>
+                    <w14:schemeClr w14:val="accent2"/>
+                  </w14:solidFill>
+                </w14:textFill>
+              </w:rPr>
+            </w:pPr>
+          </w:p>
+        </w:tc>
+        <w:tc>
+          <w:tcPr>
+            <w:tcW w:w="0" w:type="auto"/>
+            <w:shd w:val="clear"/>
+            <w:vAlign w:val="center"/>
+          </w:tcPr>
+          <w:p>
+            <w:pPr>
+              <w:jc w:val="both"/>
+              <w:rPr>
+                <w:rFonts w:hint="default" w:ascii="华文中宋" w:hAnsi="华文中宋" w:eastAsia="华文中宋" w:cs="华文中宋"/>
+                <w:b/>
+                <w:bCs/>
+                <w:color w:val="FF0000"/>
+                <w:spacing w:val="7"/>
+                <w:kern w:val="2"/>
+                <w:sz w:val="21"/>
+                <w:szCs w:val="21"/>
+                <w:lang w:val="en-US" w:eastAsia="zh-CN" w:bidi="ar-SA"/>
+              </w:rPr>
+            </w:pPr>
+            <w:r>
+              <w:rPr>
+                <w:rFonts w:hint="eastAsia" w:cs="华文中宋"/>
+                <w:bCs/>
+                <w:color w:val="FF0000"/>
+                <w:spacing w:val="7"/>
+                <w:lang w:val="en-US" w:eastAsia="zh-CN"/>
+              </w:rPr>
+              <w:t>model_dump()</w:t>
+            </w:r>
+          </w:p>
+        </w:tc>
+        <w:tc>
+          <w:tcPr>
+            <w:tcW w:w="0" w:type="auto"/>
+            <w:shd w:val="clear"/>
+            <w:vAlign w:val="center"/>
+          </w:tcPr>
+          <w:p>
+            <w:pPr>
+              <w:jc w:val="both"/>
+              <w:rPr>
+                <w:rFonts w:hint="eastAsia" w:ascii="华文中宋" w:hAnsi="华文中宋" w:eastAsia="华文中宋" w:cs="华文中宋"/>
+                <w:b/>
+                <w:bCs/>
+                <w:color w:val="EA82F1"/>
+                <w:kern w:val="2"/>
+                <w:sz w:val="21"/>
+                <w:szCs w:val="24"/>
+                <w:lang w:val="en-US" w:eastAsia="zh-CN" w:bidi="ar-SA"/>
+              </w:rPr>
+            </w:pPr>
+            <w:r>
+              <w:rPr>
+                <w:rFonts w:hint="eastAsia" w:cs="华文中宋"/>
+                <w:bCs/>
+                <w:color w:val="EA82F1"/>
+                <w:szCs w:val="24"/>
+                <w:lang w:val="en-US" w:eastAsia="zh-CN"/>
+              </w:rPr>
+              <w:t>导出</w:t>
+            </w:r>
+          </w:p>
+        </w:tc>
+      </w:tr>
+    </w:tbl>
+    <w:p>
+      <w:pPr>
+        <w:rPr>
+          <w:rFonts w:cs="华文中宋"/>
+          <w:bCs/>
+          <w:color w:val="00B0F0"/>
+          <w:szCs w:val="24"/>
+        </w:rPr>
+      </w:pPr>
+    </w:p>
+    <w:p>
+      <w:pPr>
+        <w:rPr>
+          <w:rFonts w:cs="华文中宋"/>
+          <w:bCs/>
+          <w:color w:val="00B0F0"/>
+          <w:szCs w:val="24"/>
+        </w:rPr>
+      </w:pPr>
+    </w:p>
+    <w:p>
+      <w:pPr>
+        <w:rPr>
+          <w:rFonts w:cs="华文中宋"/>
+          <w:bCs/>
+          <w:color w:val="00B0F0"/>
+          <w:szCs w:val="24"/>
+        </w:rPr>
+      </w:pPr>
+    </w:p>
+    <w:p>
+      <w:pPr>
         <w:outlineLvl w:val="0"/>
         <w:rPr>
           <w:rFonts w:hint="eastAsia" w:cs="华文中宋"/>
@@ -4172,6 +5624,22 @@
         </w:rPr>
         <w:t>：</w:t>
       </w:r>
+    </w:p>
+    <w:p>
+      <w:pPr>
+        <w:outlineLvl w:val="9"/>
+        <w:rPr>
+          <w:rFonts w:hint="eastAsia" w:cs="华文中宋"/>
+          <w:bCs/>
+          <w:color w:val="70AD47" w:themeColor="accent6"/>
+          <w:szCs w:val="24"/>
+          <w14:textFill>
+            <w14:solidFill>
+              <w14:schemeClr w14:val="accent6"/>
+            </w14:solidFill>
+          </w14:textFill>
+        </w:rPr>
+      </w:pPr>
     </w:p>
     <w:p>
       <w:pPr>
@@ -7596,12 +9064,6 @@
             <w:insideH w:val="single" w:color="auto" w:sz="4" w:space="0"/>
             <w:insideV w:val="single" w:color="auto" w:sz="4" w:space="0"/>
           </w:tblBorders>
-          <w:tblCellMar>
-            <w:top w:w="0" w:type="dxa"/>
-            <w:left w:w="108" w:type="dxa"/>
-            <w:bottom w:w="0" w:type="dxa"/>
-            <w:right w:w="108" w:type="dxa"/>
-          </w:tblCellMar>
         </w:tblPrEx>
         <w:trPr>
           <w:trHeight w:val="139" w:hRule="atLeast"/>
@@ -7881,6 +9343,12 @@
             <w:insideH w:val="single" w:color="auto" w:sz="4" w:space="0"/>
             <w:insideV w:val="single" w:color="auto" w:sz="4" w:space="0"/>
           </w:tblBorders>
+          <w:tblCellMar>
+            <w:top w:w="0" w:type="dxa"/>
+            <w:left w:w="108" w:type="dxa"/>
+            <w:bottom w:w="0" w:type="dxa"/>
+            <w:right w:w="108" w:type="dxa"/>
+          </w:tblCellMar>
         </w:tblPrEx>
         <w:trPr>
           <w:trHeight w:val="139" w:hRule="atLeast"/>
@@ -14209,8 +15677,6 @@
         </w:rPr>
         <w:t>physical</w:t>
       </w:r>
-      <w:bookmarkStart w:id="8" w:name="_GoBack"/>
-      <w:bookmarkEnd w:id="8"/>
     </w:p>
     <w:p>
       <w:pPr>
@@ -18521,12 +19987,6 @@
             <w:insideH w:val="single" w:color="auto" w:sz="4" w:space="0"/>
             <w:insideV w:val="single" w:color="auto" w:sz="4" w:space="0"/>
           </w:tblBorders>
-          <w:tblCellMar>
-            <w:top w:w="0" w:type="dxa"/>
-            <w:left w:w="108" w:type="dxa"/>
-            <w:bottom w:w="0" w:type="dxa"/>
-            <w:right w:w="108" w:type="dxa"/>
-          </w:tblCellMar>
         </w:tblPrEx>
         <w:tc>
           <w:tcPr>
@@ -24660,6 +26120,12 @@
             <w:insideH w:val="single" w:color="auto" w:sz="4" w:space="0"/>
             <w:insideV w:val="single" w:color="auto" w:sz="4" w:space="0"/>
           </w:tblBorders>
+          <w:tblCellMar>
+            <w:top w:w="0" w:type="dxa"/>
+            <w:left w:w="108" w:type="dxa"/>
+            <w:bottom w:w="0" w:type="dxa"/>
+            <w:right w:w="108" w:type="dxa"/>
+          </w:tblCellMar>
         </w:tblPrEx>
         <w:tc>
           <w:tcPr>

</xml_diff>